<commit_message>
docs(phase-03): update progress checkpoint SI-03.1 to SI-03.3 (181 unit/integration + 56 e2e passing)
</commit_message>
<xml_diff>
--- a/docs/phases/phase-03-videos/progress.docx
+++ b/docs/phases/phase-03-videos/progress.docx
@@ -26,7 +26,7 @@
         <w:t xml:space="preserve"> </w:t>
       </w:r>
       <w:r>
-        <w:t xml:space="preserve">not started</w:t>
+        <w:t xml:space="preserve">in progress</w:t>
       </w:r>
       <w:r>
         <w:t xml:space="preserve"> </w:t>
@@ -42,7 +42,7 @@
         <w:t xml:space="preserve"> </w:t>
       </w:r>
       <w:r>
-        <w:t xml:space="preserve">0/6 completed</w:t>
+        <w:t xml:space="preserve">2/6 completed</w:t>
       </w:r>
     </w:p>
     <w:bookmarkStart w:id="20" w:name="X37d7236a0f9c3352f520807bfd152671d54645d"/>
@@ -73,7 +73,7 @@
         <w:t xml:space="preserve"> </w:t>
       </w:r>
       <w:r>
-        <w:t xml:space="preserve">pending</w:t>
+        <w:t xml:space="preserve">completed (2026-08-24)</w:t>
       </w:r>
     </w:p>
     <w:p>
@@ -95,7 +95,7 @@
         <w:t xml:space="preserve"> </w:t>
       </w:r>
       <w:r>
-        <w:t xml:space="preserve">—</w:t>
+        <w:t xml:space="preserve">env.validation.integration-spec — 7 passed (storage/queue/upload defaults + required key rejection); full baseline suite 147 passed</w:t>
       </w:r>
     </w:p>
     <w:p>
@@ -117,7 +117,166 @@
         <w:t xml:space="preserve"> </w:t>
       </w:r>
       <w:r>
-        <w:t xml:space="preserve">—</w:t>
+        <w:t xml:space="preserve">Added</w:t>
+      </w:r>
+      <w:r>
+        <w:t xml:space="preserve"> </w:t>
+      </w:r>
+      <w:r>
+        <w:rPr>
+          <w:rStyle w:val="VerbatimChar"/>
+        </w:rPr>
+        <w:t xml:space="preserve">redis</w:t>
+      </w:r>
+      <w:r>
+        <w:t xml:space="preserve"> </w:t>
+      </w:r>
+      <w:r>
+        <w:t xml:space="preserve">(7-alpine, AOF),</w:t>
+      </w:r>
+      <w:r>
+        <w:t xml:space="preserve"> </w:t>
+      </w:r>
+      <w:r>
+        <w:rPr>
+          <w:rStyle w:val="VerbatimChar"/>
+        </w:rPr>
+        <w:t xml:space="preserve">minio</w:t>
+      </w:r>
+      <w:r>
+        <w:t xml:space="preserve"> </w:t>
+      </w:r>
+      <w:r>
+        <w:t xml:space="preserve">+ one-shot</w:t>
+      </w:r>
+      <w:r>
+        <w:t xml:space="preserve"> </w:t>
+      </w:r>
+      <w:r>
+        <w:rPr>
+          <w:rStyle w:val="VerbatimChar"/>
+        </w:rPr>
+        <w:t xml:space="preserve">minio-setup</w:t>
+      </w:r>
+      <w:r>
+        <w:t xml:space="preserve"> </w:t>
+      </w:r>
+      <w:r>
+        <w:t xml:space="preserve">(creates</w:t>
+      </w:r>
+      <w:r>
+        <w:t xml:space="preserve"> </w:t>
+      </w:r>
+      <w:r>
+        <w:rPr>
+          <w:rStyle w:val="VerbatimChar"/>
+        </w:rPr>
+        <w:t xml:space="preserve">videos</w:t>
+      </w:r>
+      <w:r>
+        <w:t xml:space="preserve"> </w:t>
+      </w:r>
+      <w:r>
+        <w:t xml:space="preserve">bucket), and</w:t>
+      </w:r>
+      <w:r>
+        <w:t xml:space="preserve"> </w:t>
+      </w:r>
+      <w:r>
+        <w:rPr>
+          <w:rStyle w:val="VerbatimChar"/>
+        </w:rPr>
+        <w:t xml:space="preserve">nestjs-worker</w:t>
+      </w:r>
+      <w:r>
+        <w:t xml:space="preserve"> </w:t>
+      </w:r>
+      <w:r>
+        <w:t xml:space="preserve">services to compose.yaml; all addressed by service name (never localhost). Created</w:t>
+      </w:r>
+      <w:r>
+        <w:t xml:space="preserve"> </w:t>
+      </w:r>
+      <w:r>
+        <w:rPr>
+          <w:rStyle w:val="VerbatimChar"/>
+        </w:rPr>
+        <w:t xml:space="preserve">storage</w:t>
+      </w:r>
+      <w:r>
+        <w:t xml:space="preserve">/</w:t>
+      </w:r>
+      <w:r>
+        <w:rPr>
+          <w:rStyle w:val="VerbatimChar"/>
+        </w:rPr>
+        <w:t xml:space="preserve">queue</w:t>
+      </w:r>
+      <w:r>
+        <w:t xml:space="preserve">/</w:t>
+      </w:r>
+      <w:r>
+        <w:rPr>
+          <w:rStyle w:val="VerbatimChar"/>
+        </w:rPr>
+        <w:t xml:space="preserve">upload</w:t>
+      </w:r>
+      <w:r>
+        <w:t xml:space="preserve"> </w:t>
+      </w:r>
+      <w:r>
+        <w:t xml:space="preserve">config namespaces via</w:t>
+      </w:r>
+      <w:r>
+        <w:t xml:space="preserve"> </w:t>
+      </w:r>
+      <w:r>
+        <w:rPr>
+          <w:rStyle w:val="VerbatimChar"/>
+        </w:rPr>
+        <w:t xml:space="preserve">registerAs</w:t>
+      </w:r>
+      <w:r>
+        <w:t xml:space="preserve">, extended Joi schema (STORAGE_ACCESS_KEY/SECRET_KEY required), updated</w:t>
+      </w:r>
+      <w:r>
+        <w:t xml:space="preserve"> </w:t>
+      </w:r>
+      <w:r>
+        <w:rPr>
+          <w:rStyle w:val="VerbatimChar"/>
+        </w:rPr>
+        <w:t xml:space="preserve">.env.example</w:t>
+      </w:r>
+      <w:r>
+        <w:t xml:space="preserve">. Installed deps:</w:t>
+      </w:r>
+      <w:r>
+        <w:t xml:space="preserve"> </w:t>
+      </w:r>
+      <w:r>
+        <w:t xml:space="preserve">@nestjs/bullmq</w:t>
+      </w:r>
+      <w:r>
+        <w:t xml:space="preserve">, bullmq@5.x, ioredis@5.x,</w:t>
+      </w:r>
+      <w:r>
+        <w:t xml:space="preserve"> </w:t>
+      </w:r>
+      <w:r>
+        <w:t xml:space="preserve">@aws-sdk/client-s3</w:t>
+      </w:r>
+      <w:r>
+        <w:t xml:space="preserve">,</w:t>
+      </w:r>
+      <w:r>
+        <w:t xml:space="preserve"> </w:t>
+      </w:r>
+      <w:r>
+        <w:t xml:space="preserve">@aws-sdk/s3-request-presigner</w:t>
+      </w:r>
+      <w:r>
+        <w:t xml:space="preserve">, nanoid@3.x.</w:t>
       </w:r>
     </w:p>
     <w:bookmarkEnd w:id="20"/>
@@ -149,7 +308,7 @@
         <w:t xml:space="preserve"> </w:t>
       </w:r>
       <w:r>
-        <w:t xml:space="preserve">pending</w:t>
+        <w:t xml:space="preserve">completed (2026-08-24)</w:t>
       </w:r>
     </w:p>
     <w:p>
@@ -171,7 +330,7 @@
         <w:t xml:space="preserve"> </w:t>
       </w:r>
       <w:r>
-        <w:t xml:space="preserve">—</w:t>
+        <w:t xml:space="preserve">src/videos suite — 21 passed (public-id util, Video entity persistence, VideosRepository CRUD/queries, VideosService create/find, VideosModule wiring)</w:t>
       </w:r>
     </w:p>
     <w:p>
@@ -193,7 +352,196 @@
         <w:t xml:space="preserve"> </w:t>
       </w:r>
       <w:r>
-        <w:t xml:space="preserve">—</w:t>
+        <w:t xml:space="preserve">Created</w:t>
+      </w:r>
+      <w:r>
+        <w:t xml:space="preserve"> </w:t>
+      </w:r>
+      <w:r>
+        <w:rPr>
+          <w:rStyle w:val="VerbatimChar"/>
+        </w:rPr>
+        <w:t xml:space="preserve">Video</w:t>
+      </w:r>
+      <w:r>
+        <w:t xml:space="preserve"> </w:t>
+      </w:r>
+      <w:r>
+        <w:t xml:space="preserve">entity (</w:t>
+      </w:r>
+      <w:r>
+        <w:rPr>
+          <w:rStyle w:val="VerbatimChar"/>
+        </w:rPr>
+        <w:t xml:space="preserve">@Entity('videos')</w:t>
+      </w:r>
+      <w:r>
+        <w:t xml:space="preserve">) with</w:t>
+      </w:r>
+      <w:r>
+        <w:t xml:space="preserve"> </w:t>
+      </w:r>
+      <w:r>
+        <w:rPr>
+          <w:rStyle w:val="VerbatimChar"/>
+        </w:rPr>
+        <w:t xml:space="preserve">video_status</w:t>
+      </w:r>
+      <w:r>
+        <w:t xml:space="preserve"> </w:t>
+      </w:r>
+      <w:r>
+        <w:t xml:space="preserve">enum (draft/processing/ready/error),</w:t>
+      </w:r>
+      <w:r>
+        <w:t xml:space="preserve"> </w:t>
+      </w:r>
+      <w:r>
+        <w:rPr>
+          <w:rStyle w:val="VerbatimChar"/>
+        </w:rPr>
+        <w:t xml:space="preserve">public_id</w:t>
+      </w:r>
+      <w:r>
+        <w:t xml:space="preserve"> </w:t>
+      </w:r>
+      <w:r>
+        <w:t xml:space="preserve">(nanoid 12, unique+indexed),</w:t>
+      </w:r>
+      <w:r>
+        <w:t xml:space="preserve"> </w:t>
+      </w:r>
+      <w:r>
+        <w:rPr>
+          <w:rStyle w:val="VerbatimChar"/>
+        </w:rPr>
+        <w:t xml:space="preserve">channel_id</w:t>
+      </w:r>
+      <w:r>
+        <w:t xml:space="preserve"> </w:t>
+      </w:r>
+      <w:r>
+        <w:t xml:space="preserve">FK to channels (ON DELETE CASCADE, indexed), nullable storage/processing columns,</w:t>
+      </w:r>
+      <w:r>
+        <w:t xml:space="preserve"> </w:t>
+      </w:r>
+      <w:r>
+        <w:rPr>
+          <w:rStyle w:val="VerbatimChar"/>
+        </w:rPr>
+        <w:t xml:space="preserve">file_size_bytes</w:t>
+      </w:r>
+      <w:r>
+        <w:t xml:space="preserve"> </w:t>
+      </w:r>
+      <w:r>
+        <w:t xml:space="preserve">bigint (typed</w:t>
+      </w:r>
+      <w:r>
+        <w:t xml:space="preserve"> </w:t>
+      </w:r>
+      <w:r>
+        <w:rPr>
+          <w:rStyle w:val="VerbatimChar"/>
+        </w:rPr>
+        <w:t xml:space="preserve">string | null</w:t>
+      </w:r>
+      <w:r>
+        <w:t xml:space="preserve"> </w:t>
+      </w:r>
+      <w:r>
+        <w:t xml:space="preserve">in TS),</w:t>
+      </w:r>
+      <w:r>
+        <w:t xml:space="preserve"> </w:t>
+      </w:r>
+      <w:r>
+        <w:rPr>
+          <w:rStyle w:val="VerbatimChar"/>
+        </w:rPr>
+        <w:t xml:space="preserve">metadata</w:t>
+      </w:r>
+      <w:r>
+        <w:t xml:space="preserve"> </w:t>
+      </w:r>
+      <w:r>
+        <w:t xml:space="preserve">jsonb. Added</w:t>
+      </w:r>
+      <w:r>
+        <w:t xml:space="preserve"> </w:t>
+      </w:r>
+      <w:r>
+        <w:rPr>
+          <w:rStyle w:val="VerbatimChar"/>
+        </w:rPr>
+        <w:t xml:space="preserve">generatePublicId()</w:t>
+      </w:r>
+      <w:r>
+        <w:t xml:space="preserve"> </w:t>
+      </w:r>
+      <w:r>
+        <w:t xml:space="preserve">util,</w:t>
+      </w:r>
+      <w:r>
+        <w:t xml:space="preserve"> </w:t>
+      </w:r>
+      <w:r>
+        <w:rPr>
+          <w:rStyle w:val="VerbatimChar"/>
+        </w:rPr>
+        <w:t xml:space="preserve">VideosRepository</w:t>
+      </w:r>
+      <w:r>
+        <w:t xml:space="preserve"> </w:t>
+      </w:r>
+      <w:r>
+        <w:t xml:space="preserve">wrapper (no direct EntityManager in services), basic</w:t>
+      </w:r>
+      <w:r>
+        <w:t xml:space="preserve"> </w:t>
+      </w:r>
+      <w:r>
+        <w:rPr>
+          <w:rStyle w:val="VerbatimChar"/>
+        </w:rPr>
+        <w:t xml:space="preserve">VideosService</w:t>
+      </w:r>
+      <w:r>
+        <w:t xml:space="preserve"> </w:t>
+      </w:r>
+      <w:r>
+        <w:t xml:space="preserve">(create/findByPublicId). Registered</w:t>
+      </w:r>
+      <w:r>
+        <w:t xml:space="preserve"> </w:t>
+      </w:r>
+      <w:r>
+        <w:rPr>
+          <w:rStyle w:val="VerbatimChar"/>
+        </w:rPr>
+        <w:t xml:space="preserve">VideosModule</w:t>
+      </w:r>
+      <w:r>
+        <w:t xml:space="preserve"> </w:t>
+      </w:r>
+      <w:r>
+        <w:t xml:space="preserve">(imports ChannelsModule). Migration</w:t>
+      </w:r>
+      <w:r>
+        <w:t xml:space="preserve"> </w:t>
+      </w:r>
+      <w:r>
+        <w:rPr>
+          <w:rStyle w:val="VerbatimChar"/>
+        </w:rPr>
+        <w:t xml:space="preserve">1787610093430-CreateVideos</w:t>
+      </w:r>
+      <w:r>
+        <w:t xml:space="preserve"> </w:t>
+      </w:r>
+      <w:r>
+        <w:t xml:space="preserve">generated and applied (enum + table + unique/index/FK).</w:t>
       </w:r>
     </w:p>
     <w:bookmarkEnd w:id="21"/>
@@ -225,7 +573,7 @@
         <w:t xml:space="preserve"> </w:t>
       </w:r>
       <w:r>
-        <w:t xml:space="preserve">pending</w:t>
+        <w:t xml:space="preserve">completed (3/6)</w:t>
       </w:r>
     </w:p>
     <w:p>
@@ -247,7 +595,31 @@
         <w:t xml:space="preserve"> </w:t>
       </w:r>
       <w:r>
-        <w:t xml:space="preserve">—</w:t>
+        <w:rPr>
+          <w:rStyle w:val="VerbatimChar"/>
+        </w:rPr>
+        <w:t xml:space="preserve">npm test</w:t>
+      </w:r>
+      <w:r>
+        <w:t xml:space="preserve"> </w:t>
+      </w:r>
+      <w:r>
+        <w:t xml:space="preserve">(unit+integration) — 30 suites / 181 tests green; e2e — 4 suites / 56 tests green;</w:t>
+      </w:r>
+      <w:r>
+        <w:t xml:space="preserve"> </w:t>
+      </w:r>
+      <w:r>
+        <w:rPr>
+          <w:rStyle w:val="VerbatimChar"/>
+        </w:rPr>
+        <w:t xml:space="preserve">tsc --noEmit</w:t>
+      </w:r>
+      <w:r>
+        <w:t xml:space="preserve"> </w:t>
+      </w:r>
+      <w:r>
+        <w:t xml:space="preserve">clean; lint clean on new sources. Full suite re-run twice on a dirty DB to confirm isolation/idempotency.</w:t>
       </w:r>
     </w:p>
     <w:p>
@@ -269,7 +641,268 @@
         <w:t xml:space="preserve"> </w:t>
       </w:r>
       <w:r>
-        <w:t xml:space="preserve">—</w:t>
+        <w:t xml:space="preserve">Implemented</w:t>
+      </w:r>
+      <w:r>
+        <w:t xml:space="preserve"> </w:t>
+      </w:r>
+      <w:r>
+        <w:rPr>
+          <w:rStyle w:val="VerbatimChar"/>
+        </w:rPr>
+        <w:t xml:space="preserve">StorageService</w:t>
+      </w:r>
+      <w:r>
+        <w:t xml:space="preserve"> </w:t>
+      </w:r>
+      <w:r>
+        <w:t xml:space="preserve">(S3/MinIO multipart: create/presign part URL/complete/abort, presigned GET, put/get/delete) with a separate presign client on the public endpoint. Added</w:t>
+      </w:r>
+      <w:r>
+        <w:t xml:space="preserve"> </w:t>
+      </w:r>
+      <w:r>
+        <w:rPr>
+          <w:rStyle w:val="VerbatimChar"/>
+        </w:rPr>
+        <w:t xml:space="preserve">StorageModule</w:t>
+      </w:r>
+      <w:r>
+        <w:t xml:space="preserve">. Extended</w:t>
+      </w:r>
+      <w:r>
+        <w:t xml:space="preserve"> </w:t>
+      </w:r>
+      <w:r>
+        <w:rPr>
+          <w:rStyle w:val="VerbatimChar"/>
+        </w:rPr>
+        <w:t xml:space="preserve">VideosService</w:t>
+      </w:r>
+      <w:r>
+        <w:t xml:space="preserve"> </w:t>
+      </w:r>
+      <w:r>
+        <w:t xml:space="preserve">with</w:t>
+      </w:r>
+      <w:r>
+        <w:t xml:space="preserve"> </w:t>
+      </w:r>
+      <w:r>
+        <w:rPr>
+          <w:rStyle w:val="VerbatimChar"/>
+        </w:rPr>
+        <w:t xml:space="preserve">initiateUpload</w:t>
+      </w:r>
+      <w:r>
+        <w:t xml:space="preserve"> </w:t>
+      </w:r>
+      <w:r>
+        <w:t xml:space="preserve">(ownership + file-size guards, unique</w:t>
+      </w:r>
+      <w:r>
+        <w:t xml:space="preserve"> </w:t>
+      </w:r>
+      <w:r>
+        <w:rPr>
+          <w:rStyle w:val="VerbatimChar"/>
+        </w:rPr>
+        <w:t xml:space="preserve">public_id</w:t>
+      </w:r>
+      <w:r>
+        <w:t xml:space="preserve"> </w:t>
+      </w:r>
+      <w:r>
+        <w:t xml:space="preserve">retry with abort-on-collision, draft pre-registration with</w:t>
+      </w:r>
+      <w:r>
+        <w:t xml:space="preserve"> </w:t>
+      </w:r>
+      <w:r>
+        <w:rPr>
+          <w:rStyle w:val="VerbatimChar"/>
+        </w:rPr>
+        <w:t xml:space="preserve">upload_id</w:t>
+      </w:r>
+      <w:r>
+        <w:t xml:space="preserve">),</w:t>
+      </w:r>
+      <w:r>
+        <w:t xml:space="preserve"> </w:t>
+      </w:r>
+      <w:r>
+        <w:rPr>
+          <w:rStyle w:val="VerbatimChar"/>
+        </w:rPr>
+        <w:t xml:space="preserve">getPartUploadUrl</w:t>
+      </w:r>
+      <w:r>
+        <w:t xml:space="preserve">, and</w:t>
+      </w:r>
+      <w:r>
+        <w:t xml:space="preserve"> </w:t>
+      </w:r>
+      <w:r>
+        <w:rPr>
+          <w:rStyle w:val="VerbatimChar"/>
+        </w:rPr>
+        <w:t xml:space="preserve">completeUpload</w:t>
+      </w:r>
+      <w:r>
+        <w:t xml:space="preserve"> </w:t>
+      </w:r>
+      <w:r>
+        <w:t xml:space="preserve">(status guards →</w:t>
+      </w:r>
+      <w:r>
+        <w:t xml:space="preserve"> </w:t>
+      </w:r>
+      <w:r>
+        <w:rPr>
+          <w:rStyle w:val="VerbatimChar"/>
+        </w:rPr>
+        <w:t xml:space="preserve">processing</w:t>
+      </w:r>
+      <w:r>
+        <w:t xml:space="preserve">). Added</w:t>
+      </w:r>
+      <w:r>
+        <w:t xml:space="preserve"> </w:t>
+      </w:r>
+      <w:r>
+        <w:rPr>
+          <w:rStyle w:val="VerbatimChar"/>
+        </w:rPr>
+        <w:t xml:space="preserve">InitiateUploadDto</w:t>
+      </w:r>
+      <w:r>
+        <w:t xml:space="preserve">,</w:t>
+      </w:r>
+      <w:r>
+        <w:t xml:space="preserve"> </w:t>
+      </w:r>
+      <w:r>
+        <w:rPr>
+          <w:rStyle w:val="VerbatimChar"/>
+        </w:rPr>
+        <w:t xml:space="preserve">CompleteUploadDto</w:t>
+      </w:r>
+      <w:r>
+        <w:t xml:space="preserve">,</w:t>
+      </w:r>
+      <w:r>
+        <w:t xml:space="preserve"> </w:t>
+      </w:r>
+      <w:r>
+        <w:rPr>
+          <w:rStyle w:val="VerbatimChar"/>
+        </w:rPr>
+        <w:t xml:space="preserve">VideoResponseDto</w:t>
+      </w:r>
+      <w:r>
+        <w:t xml:space="preserve">. Added</w:t>
+      </w:r>
+      <w:r>
+        <w:t xml:space="preserve"> </w:t>
+      </w:r>
+      <w:r>
+        <w:rPr>
+          <w:rStyle w:val="VerbatimChar"/>
+        </w:rPr>
+        <w:t xml:space="preserve">VideosController</w:t>
+      </w:r>
+      <w:r>
+        <w:t xml:space="preserve"> </w:t>
+      </w:r>
+      <w:r>
+        <w:t xml:space="preserve">(</w:t>
+      </w:r>
+      <w:r>
+        <w:rPr>
+          <w:rStyle w:val="VerbatimChar"/>
+        </w:rPr>
+        <w:t xml:space="preserve">POST /videos</w:t>
+      </w:r>
+      <w:r>
+        <w:t xml:space="preserve">,</w:t>
+      </w:r>
+      <w:r>
+        <w:t xml:space="preserve"> </w:t>
+      </w:r>
+      <w:r>
+        <w:rPr>
+          <w:rStyle w:val="VerbatimChar"/>
+        </w:rPr>
+        <w:t xml:space="preserve">POST /videos/:publicId/parts/:partNumber/url</w:t>
+      </w:r>
+      <w:r>
+        <w:t xml:space="preserve">,</w:t>
+      </w:r>
+      <w:r>
+        <w:t xml:space="preserve"> </w:t>
+      </w:r>
+      <w:r>
+        <w:rPr>
+          <w:rStyle w:val="VerbatimChar"/>
+        </w:rPr>
+        <w:t xml:space="preserve">POST /videos/:publicId/complete</w:t>
+      </w:r>
+      <w:r>
+        <w:t xml:space="preserve">) behind JWT with</w:t>
+      </w:r>
+      <w:r>
+        <w:t xml:space="preserve"> </w:t>
+      </w:r>
+      <w:r>
+        <w:rPr>
+          <w:rStyle w:val="VerbatimChar"/>
+        </w:rPr>
+        <w:t xml:space="preserve">@CurrentUser()</w:t>
+      </w:r>
+      <w:r>
+        <w:t xml:space="preserve">. Added domain exceptions (VIDEO_NOT_FOUND, NOT_VIDEO_OWNER, FILE_TOO_LARGE, UPLOAD_NOT_INITIATED, UPLOAD_ALREADY_COMPLETED, INVALID_STATUS_TRANSITION). Hardened shared-DB test isolation: video integration specs now clean via</w:t>
+      </w:r>
+      <w:r>
+        <w:t xml:space="preserve"> </w:t>
+      </w:r>
+      <w:r>
+        <w:rPr>
+          <w:rStyle w:val="VerbatimChar"/>
+        </w:rPr>
+        <w:t xml:space="preserve">cleanAllTables</w:t>
+      </w:r>
+      <w:r>
+        <w:t xml:space="preserve"> </w:t>
+      </w:r>
+      <w:r>
+        <w:t xml:space="preserve">+ delete</w:t>
+      </w:r>
+      <w:r>
+        <w:t xml:space="preserve"> </w:t>
+      </w:r>
+      <w:r>
+        <w:rPr>
+          <w:rStyle w:val="VerbatimChar"/>
+        </w:rPr>
+        <w:t xml:space="preserve">videos</w:t>
+      </w:r>
+      <w:r>
+        <w:t xml:space="preserve"> </w:t>
+      </w:r>
+      <w:r>
+        <w:t xml:space="preserve">in</w:t>
+      </w:r>
+      <w:r>
+        <w:t xml:space="preserve"> </w:t>
+      </w:r>
+      <w:r>
+        <w:rPr>
+          <w:rStyle w:val="VerbatimChar"/>
+        </w:rPr>
+        <w:t xml:space="preserve">afterAll</w:t>
+      </w:r>
+      <w:r>
+        <w:t xml:space="preserve">; migrations spec drops sequentially (no deadlock).</w:t>
       </w:r>
     </w:p>
     <w:bookmarkEnd w:id="22"/>

</xml_diff>

<commit_message>
feat(videos): add BullMQ queue and FFmpeg worker [SI-03.4]
- Add video-processing queue with producer (3-attempt exponential backoff)
- Add FfmpegService using child_process for metadata extraction and thumbnail generation
- Add VideoProcessingProcessor consuming jobs: download→ffprobe→ffmpeg→upload thumbnail→update Video
- Add WorkerModule and main.worker.ts bootstrap (no HTTP server)
- Add Dockerfile.worker (node:20-alpine + ffmpeg)
- Update compose.yaml with nestjs-worker service
- Integrate job emission in VideosService.completeUpload
- Add unit tests for producer and processor (mocked ffmpeg/storage/fs)
- 2 suites / 7 tests green, tsc + lint clean
</commit_message>
<xml_diff>
--- a/docs/phases/phase-03-videos/progress.docx
+++ b/docs/phases/phase-03-videos/progress.docx
@@ -42,7 +42,7 @@
         <w:t xml:space="preserve"> </w:t>
       </w:r>
       <w:r>
-        <w:t xml:space="preserve">2/6 completed</w:t>
+        <w:t xml:space="preserve">4/6 completed</w:t>
       </w:r>
     </w:p>
     <w:bookmarkStart w:id="20" w:name="X37d7236a0f9c3352f520807bfd152671d54645d"/>
@@ -934,7 +934,7 @@
         <w:t xml:space="preserve"> </w:t>
       </w:r>
       <w:r>
-        <w:t xml:space="preserve">pending</w:t>
+        <w:t xml:space="preserve">completed (2026-08-24)</w:t>
       </w:r>
     </w:p>
     <w:p>
@@ -956,7 +956,31 @@
         <w:t xml:space="preserve"> </w:t>
       </w:r>
       <w:r>
-        <w:t xml:space="preserve">—</w:t>
+        <w:rPr>
+          <w:rStyle w:val="VerbatimChar"/>
+        </w:rPr>
+        <w:t xml:space="preserve">npm test -- video-processing</w:t>
+      </w:r>
+      <w:r>
+        <w:t xml:space="preserve"> </w:t>
+      </w:r>
+      <w:r>
+        <w:t xml:space="preserve">— 2 suites / 7 tests green (VideoProcessingProducer unit, VideoProcessingProcessor unit with mocked ffmpeg/storage/fs);</w:t>
+      </w:r>
+      <w:r>
+        <w:t xml:space="preserve"> </w:t>
+      </w:r>
+      <w:r>
+        <w:rPr>
+          <w:rStyle w:val="VerbatimChar"/>
+        </w:rPr>
+        <w:t xml:space="preserve">tsc --noEmit</w:t>
+      </w:r>
+      <w:r>
+        <w:t xml:space="preserve"> </w:t>
+      </w:r>
+      <w:r>
+        <w:t xml:space="preserve">clean; lint clean</w:t>
       </w:r>
     </w:p>
     <w:p>
@@ -978,7 +1002,227 @@
         <w:t xml:space="preserve"> </w:t>
       </w:r>
       <w:r>
-        <w:t xml:space="preserve">—</w:t>
+        <w:t xml:space="preserve">Created BullMQ queue infrastructure:</w:t>
+      </w:r>
+      <w:r>
+        <w:t xml:space="preserve"> </w:t>
+      </w:r>
+      <w:r>
+        <w:rPr>
+          <w:rStyle w:val="VerbatimChar"/>
+        </w:rPr>
+        <w:t xml:space="preserve">video-processing.constants.ts</w:t>
+      </w:r>
+      <w:r>
+        <w:t xml:space="preserve"> </w:t>
+      </w:r>
+      <w:r>
+        <w:t xml:space="preserve">(queue/job names +</w:t>
+      </w:r>
+      <w:r>
+        <w:t xml:space="preserve"> </w:t>
+      </w:r>
+      <w:r>
+        <w:rPr>
+          <w:rStyle w:val="VerbatimChar"/>
+        </w:rPr>
+        <w:t xml:space="preserve">ProcessVideoJobData</w:t>
+      </w:r>
+      <w:r>
+        <w:t xml:space="preserve"> </w:t>
+      </w:r>
+      <w:r>
+        <w:t xml:space="preserve">interface),</w:t>
+      </w:r>
+      <w:r>
+        <w:t xml:space="preserve"> </w:t>
+      </w:r>
+      <w:r>
+        <w:rPr>
+          <w:rStyle w:val="VerbatimChar"/>
+        </w:rPr>
+        <w:t xml:space="preserve">video-processing.producer.ts</w:t>
+      </w:r>
+      <w:r>
+        <w:t xml:space="preserve"> </w:t>
+      </w:r>
+      <w:r>
+        <w:t xml:space="preserve">(adds jobs with 3-attempt exponential backoff retry policy),</w:t>
+      </w:r>
+      <w:r>
+        <w:t xml:space="preserve"> </w:t>
+      </w:r>
+      <w:r>
+        <w:rPr>
+          <w:rStyle w:val="VerbatimChar"/>
+        </w:rPr>
+        <w:t xml:space="preserve">video-processing.module.ts</w:t>
+      </w:r>
+      <w:r>
+        <w:t xml:space="preserve"> </w:t>
+      </w:r>
+      <w:r>
+        <w:t xml:space="preserve">(registers BullMQ with Redis config). Integrated producer into</w:t>
+      </w:r>
+      <w:r>
+        <w:t xml:space="preserve"> </w:t>
+      </w:r>
+      <w:r>
+        <w:rPr>
+          <w:rStyle w:val="VerbatimChar"/>
+        </w:rPr>
+        <w:t xml:space="preserve">VideosService.completeUpload</w:t>
+      </w:r>
+      <w:r>
+        <w:t xml:space="preserve"> </w:t>
+      </w:r>
+      <w:r>
+        <w:t xml:space="preserve">to emit job after status→PROCESSING. Created isolated worker app in</w:t>
+      </w:r>
+      <w:r>
+        <w:t xml:space="preserve"> </w:t>
+      </w:r>
+      <w:r>
+        <w:rPr>
+          <w:rStyle w:val="VerbatimChar"/>
+        </w:rPr>
+        <w:t xml:space="preserve">src/worker/</w:t>
+      </w:r>
+      <w:r>
+        <w:t xml:space="preserve">:</w:t>
+      </w:r>
+      <w:r>
+        <w:t xml:space="preserve"> </w:t>
+      </w:r>
+      <w:r>
+        <w:rPr>
+          <w:rStyle w:val="VerbatimChar"/>
+        </w:rPr>
+        <w:t xml:space="preserve">FfmpegService</w:t>
+      </w:r>
+      <w:r>
+        <w:t xml:space="preserve"> </w:t>
+      </w:r>
+      <w:r>
+        <w:t xml:space="preserve">(child_process wrappers for ffprobe metadata extraction + ffmpeg thumbnail generation),</w:t>
+      </w:r>
+      <w:r>
+        <w:t xml:space="preserve"> </w:t>
+      </w:r>
+      <w:r>
+        <w:rPr>
+          <w:rStyle w:val="VerbatimChar"/>
+        </w:rPr>
+        <w:t xml:space="preserve">VideoProcessingProcessor</w:t>
+      </w:r>
+      <w:r>
+        <w:t xml:space="preserve"> </w:t>
+      </w:r>
+      <w:r>
+        <w:t xml:space="preserve">(BullMQ</w:t>
+      </w:r>
+      <w:r>
+        <w:t xml:space="preserve"> </w:t>
+      </w:r>
+      <w:r>
+        <w:t xml:space="preserve">@Processor</w:t>
+      </w:r>
+      <w:r>
+        <w:t xml:space="preserve"> </w:t>
+      </w:r>
+      <w:r>
+        <w:t xml:space="preserve">consuming jobs: downloads video from storage→/tmp, extracts metadata, generates thumbnail at 10% duration or 5s, uploads thumbnail to storage, updates Video entity with status=READY/duration/thumbnailKey/metadata, cleanup temp files, error handling with status=ERROR + processingError). Created</w:t>
+      </w:r>
+      <w:r>
+        <w:t xml:space="preserve"> </w:t>
+      </w:r>
+      <w:r>
+        <w:rPr>
+          <w:rStyle w:val="VerbatimChar"/>
+        </w:rPr>
+        <w:t xml:space="preserve">WorkerModule</w:t>
+      </w:r>
+      <w:r>
+        <w:t xml:space="preserve"> </w:t>
+      </w:r>
+      <w:r>
+        <w:t xml:space="preserve">(TypeORM + BullMQ consumer + StorageModule, no HTTP server) and</w:t>
+      </w:r>
+      <w:r>
+        <w:t xml:space="preserve"> </w:t>
+      </w:r>
+      <w:r>
+        <w:rPr>
+          <w:rStyle w:val="VerbatimChar"/>
+        </w:rPr>
+        <w:t xml:space="preserve">main.worker.ts</w:t>
+      </w:r>
+      <w:r>
+        <w:t xml:space="preserve"> </w:t>
+      </w:r>
+      <w:r>
+        <w:t xml:space="preserve">bootstrap. Created</w:t>
+      </w:r>
+      <w:r>
+        <w:t xml:space="preserve"> </w:t>
+      </w:r>
+      <w:r>
+        <w:rPr>
+          <w:rStyle w:val="VerbatimChar"/>
+        </w:rPr>
+        <w:t xml:space="preserve">Dockerfile.worker</w:t>
+      </w:r>
+      <w:r>
+        <w:t xml:space="preserve"> </w:t>
+      </w:r>
+      <w:r>
+        <w:t xml:space="preserve">(node:20-alpine + ffmpeg via apk). Updated</w:t>
+      </w:r>
+      <w:r>
+        <w:t xml:space="preserve"> </w:t>
+      </w:r>
+      <w:r>
+        <w:rPr>
+          <w:rStyle w:val="VerbatimChar"/>
+        </w:rPr>
+        <w:t xml:space="preserve">compose.yaml</w:t>
+      </w:r>
+      <w:r>
+        <w:t xml:space="preserve">: nestjs-worker service with Dockerfile.worker build, DATABASE_</w:t>
+      </w:r>
+      <w:r>
+        <w:rPr>
+          <w:iCs/>
+          <w:i/>
+        </w:rPr>
+        <w:t xml:space="preserve">/S3_</w:t>
+      </w:r>
+      <w:r>
+        <w:t xml:space="preserve">/REDIS_* env vars using service names. All error handling uses type-safe</w:t>
+      </w:r>
+      <w:r>
+        <w:t xml:space="preserve"> </w:t>
+      </w:r>
+      <w:r>
+        <w:rPr>
+          <w:rStyle w:val="VerbatimChar"/>
+        </w:rPr>
+        <w:t xml:space="preserve">getErrorMessage</w:t>
+      </w:r>
+      <w:r>
+        <w:t xml:space="preserve">/</w:t>
+      </w:r>
+      <w:r>
+        <w:rPr>
+          <w:rStyle w:val="VerbatimChar"/>
+        </w:rPr>
+        <w:t xml:space="preserve">getErrorStack</w:t>
+      </w:r>
+      <w:r>
+        <w:t xml:space="preserve"> </w:t>
+      </w:r>
+      <w:r>
+        <w:t xml:space="preserve">helpers.</w:t>
       </w:r>
     </w:p>
     <w:bookmarkEnd w:id="23"/>

</xml_diff>

<commit_message>
feat(videos): add streaming and download endpoints [SI-03.5]
- Add getStreamUrl and getDownloadUrl methods to VideosService (enforce status=READY)
- Add GET /videos/:publicId/stream endpoint (302 redirect to presigned URL, supports Range/206)
- Add GET /videos/:publicId/download endpoint (302 redirect with Content-Disposition attachment)
- Add comprehensive e2e test suite videos-streaming.e2e-spec.ts
- 1 suite / 7 tests green, tsc clean
</commit_message>
<xml_diff>
--- a/docs/phases/phase-03-videos/progress.docx
+++ b/docs/phases/phase-03-videos/progress.docx
@@ -42,7 +42,7 @@
         <w:t xml:space="preserve"> </w:t>
       </w:r>
       <w:r>
-        <w:t xml:space="preserve">4/6 completed</w:t>
+        <w:t xml:space="preserve">5/6 completed</w:t>
       </w:r>
     </w:p>
     <w:bookmarkStart w:id="20" w:name="X37d7236a0f9c3352f520807bfd152671d54645d"/>
@@ -1254,7 +1254,7 @@
         <w:t xml:space="preserve"> </w:t>
       </w:r>
       <w:r>
-        <w:t xml:space="preserve">pending</w:t>
+        <w:t xml:space="preserve">completed (2026-08-24)</w:t>
       </w:r>
     </w:p>
     <w:p>
@@ -1276,7 +1276,31 @@
         <w:t xml:space="preserve"> </w:t>
       </w:r>
       <w:r>
-        <w:t xml:space="preserve">—</w:t>
+        <w:rPr>
+          <w:rStyle w:val="VerbatimChar"/>
+        </w:rPr>
+        <w:t xml:space="preserve">npm run test:e2e -- videos-streaming</w:t>
+      </w:r>
+      <w:r>
+        <w:t xml:space="preserve"> </w:t>
+      </w:r>
+      <w:r>
+        <w:t xml:space="preserve">— 1 suite / 7 tests green (stream/download redirect for READY videos, 404 for non-existent/draft, 401 without auth);</w:t>
+      </w:r>
+      <w:r>
+        <w:t xml:space="preserve"> </w:t>
+      </w:r>
+      <w:r>
+        <w:rPr>
+          <w:rStyle w:val="VerbatimChar"/>
+        </w:rPr>
+        <w:t xml:space="preserve">tsc --noEmit</w:t>
+      </w:r>
+      <w:r>
+        <w:t xml:space="preserve"> </w:t>
+      </w:r>
+      <w:r>
+        <w:t xml:space="preserve">clean</w:t>
       </w:r>
     </w:p>
     <w:p>
@@ -1298,7 +1322,142 @@
         <w:t xml:space="preserve"> </w:t>
       </w:r>
       <w:r>
-        <w:t xml:space="preserve">—</w:t>
+        <w:t xml:space="preserve">Added</w:t>
+      </w:r>
+      <w:r>
+        <w:t xml:space="preserve"> </w:t>
+      </w:r>
+      <w:r>
+        <w:rPr>
+          <w:rStyle w:val="VerbatimChar"/>
+        </w:rPr>
+        <w:t xml:space="preserve">getStreamUrl</w:t>
+      </w:r>
+      <w:r>
+        <w:t xml:space="preserve"> </w:t>
+      </w:r>
+      <w:r>
+        <w:t xml:space="preserve">and</w:t>
+      </w:r>
+      <w:r>
+        <w:t xml:space="preserve"> </w:t>
+      </w:r>
+      <w:r>
+        <w:rPr>
+          <w:rStyle w:val="VerbatimChar"/>
+        </w:rPr>
+        <w:t xml:space="preserve">getDownloadUrl</w:t>
+      </w:r>
+      <w:r>
+        <w:t xml:space="preserve"> </w:t>
+      </w:r>
+      <w:r>
+        <w:t xml:space="preserve">methods to</w:t>
+      </w:r>
+      <w:r>
+        <w:t xml:space="preserve"> </w:t>
+      </w:r>
+      <w:r>
+        <w:rPr>
+          <w:rStyle w:val="VerbatimChar"/>
+        </w:rPr>
+        <w:t xml:space="preserve">VideosService</w:t>
+      </w:r>
+      <w:r>
+        <w:t xml:space="preserve"> </w:t>
+      </w:r>
+      <w:r>
+        <w:t xml:space="preserve">(both enforce status=READY, throw VideoNotFoundException otherwise). Added</w:t>
+      </w:r>
+      <w:r>
+        <w:t xml:space="preserve"> </w:t>
+      </w:r>
+      <w:r>
+        <w:rPr>
+          <w:rStyle w:val="VerbatimChar"/>
+        </w:rPr>
+        <w:t xml:space="preserve">GET /videos/:publicId/stream</w:t>
+      </w:r>
+      <w:r>
+        <w:t xml:space="preserve"> </w:t>
+      </w:r>
+      <w:r>
+        <w:t xml:space="preserve">and</w:t>
+      </w:r>
+      <w:r>
+        <w:t xml:space="preserve"> </w:t>
+      </w:r>
+      <w:r>
+        <w:rPr>
+          <w:rStyle w:val="VerbatimChar"/>
+        </w:rPr>
+        <w:t xml:space="preserve">GET /videos/:publicId/download</w:t>
+      </w:r>
+      <w:r>
+        <w:t xml:space="preserve"> </w:t>
+      </w:r>
+      <w:r>
+        <w:t xml:space="preserve">endpoints to</w:t>
+      </w:r>
+      <w:r>
+        <w:t xml:space="preserve"> </w:t>
+      </w:r>
+      <w:r>
+        <w:rPr>
+          <w:rStyle w:val="VerbatimChar"/>
+        </w:rPr>
+        <w:t xml:space="preserve">VideosController</w:t>
+      </w:r>
+      <w:r>
+        <w:t xml:space="preserve"> </w:t>
+      </w:r>
+      <w:r>
+        <w:t xml:space="preserve">with</w:t>
+      </w:r>
+      <w:r>
+        <w:t xml:space="preserve"> </w:t>
+      </w:r>
+      <w:r>
+        <w:rPr>
+          <w:rStyle w:val="VerbatimChar"/>
+        </w:rPr>
+        <w:t xml:space="preserve">@Redirect()</w:t>
+      </w:r>
+      <w:r>
+        <w:t xml:space="preserve"> </w:t>
+      </w:r>
+      <w:r>
+        <w:t xml:space="preserve">decorator (returns 302 with presigned URL in Location header). Stream endpoint returns plain presigned GET URL (MinIO natively supports Range requests/HTTP 206). Download endpoint adds</w:t>
+      </w:r>
+      <w:r>
+        <w:t xml:space="preserve"> </w:t>
+      </w:r>
+      <w:r>
+        <w:rPr>
+          <w:rStyle w:val="VerbatimChar"/>
+        </w:rPr>
+        <w:t xml:space="preserve">Content-Disposition: attachment; filename="..."</w:t>
+      </w:r>
+      <w:r>
+        <w:t xml:space="preserve"> </w:t>
+      </w:r>
+      <w:r>
+        <w:t xml:space="preserve">via storage service opts. Both endpoints behind JWT guard. Created comprehensive e2e test suite</w:t>
+      </w:r>
+      <w:r>
+        <w:t xml:space="preserve"> </w:t>
+      </w:r>
+      <w:r>
+        <w:rPr>
+          <w:rStyle w:val="VerbatimChar"/>
+        </w:rPr>
+        <w:t xml:space="preserve">videos-streaming.e2e-spec.ts</w:t>
+      </w:r>
+      <w:r>
+        <w:t xml:space="preserve"> </w:t>
+      </w:r>
+      <w:r>
+        <w:t xml:space="preserve">covering ready/draft/non-existent scenarios.</w:t>
       </w:r>
     </w:p>
     <w:bookmarkEnd w:id="24"/>

</xml_diff>

<commit_message>
feat(videos): add complementary REST endpoints [SI-03.6]
- Add getVideoDetails (public if READY, owner-only otherwise, with thumbnail URL)
- Add listChannelVideos with pagination (limit=20, READY only)
- Add updateVideo (PATCH title/description, owner only)
- Add deleteVideo (removes storage + DB, owner only)
- Add findByChannelWithStatus to VideosRepository (paginated)
- Add GET /videos/:publicId (@Public, conditional access)
- Add GET /channels/:channelId/videos (paginated list)
- Add PATCH /videos/:publicId (owner only)
- Add DELETE /videos/:publicId (204 No Content)
- Add UpdateVideoDto for validation
- Update VideosService unit tests with VideoProcessingProducer mock
- All 6 SIs completed, tsc clean
</commit_message>
<xml_diff>
--- a/docs/phases/phase-03-videos/progress.docx
+++ b/docs/phases/phase-03-videos/progress.docx
@@ -26,7 +26,7 @@
         <w:t xml:space="preserve"> </w:t>
       </w:r>
       <w:r>
-        <w:t xml:space="preserve">in progress</w:t>
+        <w:t xml:space="preserve">completed</w:t>
       </w:r>
       <w:r>
         <w:t xml:space="preserve"> </w:t>
@@ -42,7 +42,7 @@
         <w:t xml:space="preserve"> </w:t>
       </w:r>
       <w:r>
-        <w:t xml:space="preserve">5/6 completed</w:t>
+        <w:t xml:space="preserve">6/6 completed</w:t>
       </w:r>
     </w:p>
     <w:bookmarkStart w:id="20" w:name="X37d7236a0f9c3352f520807bfd152671d54645d"/>
@@ -1489,7 +1489,7 @@
         <w:t xml:space="preserve"> </w:t>
       </w:r>
       <w:r>
-        <w:t xml:space="preserve">pending</w:t>
+        <w:t xml:space="preserve">completed (2026-08-24)</w:t>
       </w:r>
     </w:p>
     <w:p>
@@ -1511,7 +1511,31 @@
         <w:t xml:space="preserve"> </w:t>
       </w:r>
       <w:r>
-        <w:t xml:space="preserve">—</w:t>
+        <w:rPr>
+          <w:rStyle w:val="VerbatimChar"/>
+        </w:rPr>
+        <w:t xml:space="preserve">npm test -- videos.service.spec</w:t>
+      </w:r>
+      <w:r>
+        <w:t xml:space="preserve"> </w:t>
+      </w:r>
+      <w:r>
+        <w:t xml:space="preserve">— 1 suite / 13 tests green (including new methods);</w:t>
+      </w:r>
+      <w:r>
+        <w:t xml:space="preserve"> </w:t>
+      </w:r>
+      <w:r>
+        <w:rPr>
+          <w:rStyle w:val="VerbatimChar"/>
+        </w:rPr>
+        <w:t xml:space="preserve">tsc --noEmit</w:t>
+      </w:r>
+      <w:r>
+        <w:t xml:space="preserve"> </w:t>
+      </w:r>
+      <w:r>
+        <w:t xml:space="preserve">clean</w:t>
       </w:r>
     </w:p>
     <w:p>
@@ -1533,7 +1557,220 @@
         <w:t xml:space="preserve"> </w:t>
       </w:r>
       <w:r>
-        <w:t xml:space="preserve">—</w:t>
+        <w:t xml:space="preserve">Added</w:t>
+      </w:r>
+      <w:r>
+        <w:t xml:space="preserve"> </w:t>
+      </w:r>
+      <w:r>
+        <w:rPr>
+          <w:rStyle w:val="VerbatimChar"/>
+        </w:rPr>
+        <w:t xml:space="preserve">getVideoDetails</w:t>
+      </w:r>
+      <w:r>
+        <w:t xml:space="preserve"> </w:t>
+      </w:r>
+      <w:r>
+        <w:t xml:space="preserve">method to</w:t>
+      </w:r>
+      <w:r>
+        <w:t xml:space="preserve"> </w:t>
+      </w:r>
+      <w:r>
+        <w:rPr>
+          <w:rStyle w:val="VerbatimChar"/>
+        </w:rPr>
+        <w:t xml:space="preserve">VideosService</w:t>
+      </w:r>
+      <w:r>
+        <w:t xml:space="preserve"> </w:t>
+      </w:r>
+      <w:r>
+        <w:t xml:space="preserve">(public if status=READY, owner-only otherwise, includes presigned thumbnail URL). Added</w:t>
+      </w:r>
+      <w:r>
+        <w:t xml:space="preserve"> </w:t>
+      </w:r>
+      <w:r>
+        <w:rPr>
+          <w:rStyle w:val="VerbatimChar"/>
+        </w:rPr>
+        <w:t xml:space="preserve">listChannelVideos</w:t>
+      </w:r>
+      <w:r>
+        <w:t xml:space="preserve"> </w:t>
+      </w:r>
+      <w:r>
+        <w:t xml:space="preserve">with pagination support (limit=20, READY only, presigned thumbnails). Added</w:t>
+      </w:r>
+      <w:r>
+        <w:t xml:space="preserve"> </w:t>
+      </w:r>
+      <w:r>
+        <w:rPr>
+          <w:rStyle w:val="VerbatimChar"/>
+        </w:rPr>
+        <w:t xml:space="preserve">updateVideo</w:t>
+      </w:r>
+      <w:r>
+        <w:t xml:space="preserve"> </w:t>
+      </w:r>
+      <w:r>
+        <w:t xml:space="preserve">(title/description, owner only) and</w:t>
+      </w:r>
+      <w:r>
+        <w:t xml:space="preserve"> </w:t>
+      </w:r>
+      <w:r>
+        <w:rPr>
+          <w:rStyle w:val="VerbatimChar"/>
+        </w:rPr>
+        <w:t xml:space="preserve">deleteVideo</w:t>
+      </w:r>
+      <w:r>
+        <w:t xml:space="preserve"> </w:t>
+      </w:r>
+      <w:r>
+        <w:t xml:space="preserve">(removes from storage + DB, owner only). Added</w:t>
+      </w:r>
+      <w:r>
+        <w:t xml:space="preserve"> </w:t>
+      </w:r>
+      <w:r>
+        <w:rPr>
+          <w:rStyle w:val="VerbatimChar"/>
+        </w:rPr>
+        <w:t xml:space="preserve">findByChannelWithStatus</w:t>
+      </w:r>
+      <w:r>
+        <w:t xml:space="preserve"> </w:t>
+      </w:r>
+      <w:r>
+        <w:t xml:space="preserve">method to</w:t>
+      </w:r>
+      <w:r>
+        <w:t xml:space="preserve"> </w:t>
+      </w:r>
+      <w:r>
+        <w:rPr>
+          <w:rStyle w:val="VerbatimChar"/>
+        </w:rPr>
+        <w:t xml:space="preserve">VideosRepository</w:t>
+      </w:r>
+      <w:r>
+        <w:t xml:space="preserve"> </w:t>
+      </w:r>
+      <w:r>
+        <w:t xml:space="preserve">with pagination (skip/take). Created</w:t>
+      </w:r>
+      <w:r>
+        <w:t xml:space="preserve"> </w:t>
+      </w:r>
+      <w:r>
+        <w:rPr>
+          <w:rStyle w:val="VerbatimChar"/>
+        </w:rPr>
+        <w:t xml:space="preserve">UpdateVideoDto</w:t>
+      </w:r>
+      <w:r>
+        <w:t xml:space="preserve"> </w:t>
+      </w:r>
+      <w:r>
+        <w:t xml:space="preserve">for PATCH validation. Added 4 new endpoints to</w:t>
+      </w:r>
+      <w:r>
+        <w:t xml:space="preserve"> </w:t>
+      </w:r>
+      <w:r>
+        <w:rPr>
+          <w:rStyle w:val="VerbatimChar"/>
+        </w:rPr>
+        <w:t xml:space="preserve">VideosController</w:t>
+      </w:r>
+      <w:r>
+        <w:t xml:space="preserve">:</w:t>
+      </w:r>
+      <w:r>
+        <w:t xml:space="preserve"> </w:t>
+      </w:r>
+      <w:r>
+        <w:rPr>
+          <w:rStyle w:val="VerbatimChar"/>
+        </w:rPr>
+        <w:t xml:space="preserve">GET /videos/:publicId</w:t>
+      </w:r>
+      <w:r>
+        <w:t xml:space="preserve"> </w:t>
+      </w:r>
+      <w:r>
+        <w:t xml:space="preserve">(</w:t>
+      </w:r>
+      <w:r>
+        <w:t xml:space="preserve">@Public</w:t>
+      </w:r>
+      <w:r>
+        <w:t xml:space="preserve">, conditional access),</w:t>
+      </w:r>
+      <w:r>
+        <w:t xml:space="preserve"> </w:t>
+      </w:r>
+      <w:r>
+        <w:rPr>
+          <w:rStyle w:val="VerbatimChar"/>
+        </w:rPr>
+        <w:t xml:space="preserve">GET /channels/:channelId/videos</w:t>
+      </w:r>
+      <w:r>
+        <w:t xml:space="preserve"> </w:t>
+      </w:r>
+      <w:r>
+        <w:t xml:space="preserve">(paginated list),</w:t>
+      </w:r>
+      <w:r>
+        <w:t xml:space="preserve"> </w:t>
+      </w:r>
+      <w:r>
+        <w:rPr>
+          <w:rStyle w:val="VerbatimChar"/>
+        </w:rPr>
+        <w:t xml:space="preserve">PATCH /videos/:publicId</w:t>
+      </w:r>
+      <w:r>
+        <w:t xml:space="preserve"> </w:t>
+      </w:r>
+      <w:r>
+        <w:t xml:space="preserve">(owner only),</w:t>
+      </w:r>
+      <w:r>
+        <w:t xml:space="preserve"> </w:t>
+      </w:r>
+      <w:r>
+        <w:rPr>
+          <w:rStyle w:val="VerbatimChar"/>
+        </w:rPr>
+        <w:t xml:space="preserve">DELETE /videos/:publicId</w:t>
+      </w:r>
+      <w:r>
+        <w:t xml:space="preserve"> </w:t>
+      </w:r>
+      <w:r>
+        <w:t xml:space="preserve">(204 No Content, owner only). All endpoints include comprehensive Swagger annotations. Updated unit tests to include</w:t>
+      </w:r>
+      <w:r>
+        <w:t xml:space="preserve"> </w:t>
+      </w:r>
+      <w:r>
+        <w:rPr>
+          <w:rStyle w:val="VerbatimChar"/>
+        </w:rPr>
+        <w:t xml:space="preserve">VideoProcessingProducer</w:t>
+      </w:r>
+      <w:r>
+        <w:t xml:space="preserve"> </w:t>
+      </w:r>
+      <w:r>
+        <w:t xml:space="preserve">mock.</w:t>
       </w:r>
     </w:p>
     <w:bookmarkEnd w:id="25"/>

</xml_diff>